<commit_message>
security: close residual hardening risks
Cierra los riesgos residuales identificados por el inventario final y deja evidencia reproducible de la Fase 6.

- restringe el registro API a administradores con MFA verificado y audita cada alta
- devuelve errores internos genéricos y conserva los detalles sólo en logs
- aplica límites explícitos a telemetría, polling, histórico, alertas y parvada
- elimina el secreto de desarrollo y exige SECRET_KEY robusta en el dashboard
- incorpora pruebas de autorización, redacción y rate limit
- actualiza la matriz, la guía de cierre y el DOCX con diez espacios para capturas

Validado en WSL con Compose, cinco servicios healthy, 37 pruebas OK, smoke tests HTTP y configuración/cabeceras Nginx aprobadas.
</commit_message>
<xml_diff>
--- a/docs/evidence/commit29/guia_despliegue_evidencia_seguridad_commit_29.docx
+++ b/docs/evidence/commit29/guia_despliegue_evidencia_seguridad_commit_29.docx
@@ -14,7 +14,7 @@
           <w:color w:val="2E74B5"/>
           <w:sz w:val="20"/>
         </w:rPr>
-        <w:t>FASE 6 · DOCUMENTACIÓN FINAL</w:t>
+        <w:t>FASE 6 - DOCUMENTACIÓN FINAL</w:t>
       </w:r>
     </w:p>
     <w:p>
@@ -34,7 +34,7 @@
         <w:jc w:val="center"/>
       </w:pPr>
       <w:r>
-        <w:t>Poultry IoT System v2 · Commit 29</w:t>
+        <w:t>Poultry IoT System v2 - Commits 25 a 30 + cierre residual</w:t>
       </w:r>
     </w:p>
     <w:tbl>
@@ -192,7 +192,9 @@
               <w:spacing w:before="0" w:after="0" w:line="264" w:lineRule="auto"/>
               <w:jc w:val="left"/>
             </w:pPr>
-            <w:r/>
+            <w:r>
+              <w:t>Documentación integral de Fase 6 y plantilla de evidencias</w:t>
+            </w:r>
             <w:r>
               <w:rPr>
                 <w:rFonts w:ascii="Calibri" w:hAnsi="Calibri" w:eastAsia="Calibri"/>
@@ -200,7 +202,6 @@
                 <w:color w:val="0B2545"/>
                 <w:sz w:val="19"/>
               </w:rPr>
-              <w:t>Runbook operativo y plantilla de evidencias</w:t>
             </w:r>
           </w:p>
         </w:tc>
@@ -270,7 +271,9 @@
               <w:spacing w:before="0" w:after="0" w:line="264" w:lineRule="auto"/>
               <w:jc w:val="left"/>
             </w:pPr>
-            <w:r/>
+            <w:r>
+              <w:t>security: close residual hardening risks</w:t>
+            </w:r>
             <w:r>
               <w:rPr>
                 <w:rFonts w:ascii="Calibri" w:hAnsi="Calibri" w:eastAsia="Calibri"/>
@@ -278,7 +281,6 @@
                 <w:color w:val="0B2545"/>
                 <w:sz w:val="19"/>
               </w:rPr>
-              <w:t>docs: add deployment and security evidence guide</w:t>
             </w:r>
           </w:p>
         </w:tc>
@@ -348,7 +350,9 @@
               <w:spacing w:before="0" w:after="0" w:line="264" w:lineRule="auto"/>
               <w:jc w:val="left"/>
             </w:pPr>
-            <w:r/>
+            <w:r>
+              <w:t>7 de agosto de 2026</w:t>
+            </w:r>
             <w:r>
               <w:rPr>
                 <w:rFonts w:ascii="Calibri" w:hAnsi="Calibri" w:eastAsia="Calibri"/>
@@ -356,7 +360,6 @@
                 <w:color w:val="0B2545"/>
                 <w:sz w:val="19"/>
               </w:rPr>
-              <w:t>5 de agosto de 2026</w:t>
             </w:r>
           </w:p>
         </w:tc>
@@ -426,7 +429,9 @@
               <w:spacing w:before="0" w:after="0" w:line="264" w:lineRule="auto"/>
               <w:jc w:val="left"/>
             </w:pPr>
-            <w:r/>
+            <w:r>
+              <w:t>Cierre técnico preparado; capturas pendientes</w:t>
+            </w:r>
             <w:r>
               <w:rPr>
                 <w:rFonts w:ascii="Calibri" w:hAnsi="Calibri" w:eastAsia="Calibri"/>
@@ -434,7 +439,6 @@
                 <w:color w:val="0B2545"/>
                 <w:sz w:val="19"/>
               </w:rPr>
-              <w:t>Implementación documental; capturas reservadas</w:t>
             </w:r>
           </w:p>
         </w:tc>
@@ -487,7 +491,7 @@
                 <w:color w:val="1F4D78"/>
                 <w:sz w:val="21"/>
               </w:rPr>
-              <w:t xml:space="preserve">Resultado: </w:t>
+              <w:t>Resultado: Concentrar en un solo documento los controles 25 a 30, la remediación residual, el despliegue, el rollback y diez evidencias seguras.</w:t>
             </w:r>
             <w:r>
               <w:rPr>
@@ -495,7 +499,6 @@
                 <w:color w:val="0B2545"/>
                 <w:sz w:val="21"/>
               </w:rPr>
-              <w:t>Concentrar en un solo documento las validaciones de dependencias, contenedores y Nginx, el despliegue documental, el rollback y diez evidencias seguras.</w:t>
             </w:r>
           </w:p>
         </w:tc>
@@ -528,7 +531,7 @@
           <w:rFonts w:ascii="Calibri" w:hAnsi="Calibri" w:eastAsia="Calibri"/>
           <w:color w:val="0B2545"/>
         </w:rPr>
-        <w:t>Controles de los commits 25 a 28 y cierre documental del commit 29.</w:t>
+        <w:t>Controles de los commits 25 a 30 y cierre residual sin numeración.</w:t>
       </w:r>
     </w:p>
     <w:p>
@@ -544,7 +547,7 @@
           <w:rFonts w:ascii="Calibri" w:hAnsi="Calibri" w:eastAsia="Calibri"/>
           <w:color w:val="0B2545"/>
         </w:rPr>
-        <w:t>Validaciones locales en WSL, GitHub Actions y smoke test del Droplet.</w:t>
+        <w:t>Validaciones locales en WSL, GitHub Actions, riesgos y smoke test del Droplet.</w:t>
       </w:r>
     </w:p>
     <w:p>
@@ -597,7 +600,7 @@
         <w:keepNext w:val="0"/>
       </w:pPr>
       <w:r>
-        <w:t>El Markdown del repositorio es la fuente operativa. Este DOCX conserva una versión formal y espacios amplios para insertar evidencia visual después de revisar que cada captura sea segura.</w:t>
+        <w:t>El Markdown del repositorio es la fuente operativa. Este DOCX conserva la versión formal de la Fase 6, el inventario final, el cierre de riesgos residuales y espacios amplios para insertar evidencia visual segura.</w:t>
       </w:r>
     </w:p>
     <w:p>
@@ -1422,7 +1425,9 @@
               <w:spacing w:before="0" w:after="0" w:line="264" w:lineRule="auto"/>
               <w:jc w:val="left"/>
             </w:pPr>
-            <w:r/>
+            <w:r>
+              <w:t>Cierre técnico</w:t>
+            </w:r>
             <w:r>
               <w:rPr>
                 <w:rFonts w:ascii="Calibri" w:hAnsi="Calibri" w:eastAsia="Calibri"/>
@@ -1430,7 +1435,6 @@
                 <w:color w:val="0B2545"/>
                 <w:sz w:val="17"/>
               </w:rPr>
-              <w:t>Reproducibilidad</w:t>
             </w:r>
           </w:p>
         </w:tc>
@@ -1459,7 +1463,9 @@
               <w:spacing w:before="0" w:after="0" w:line="264" w:lineRule="auto"/>
               <w:jc w:val="left"/>
             </w:pPr>
-            <w:r/>
+            <w:r>
+              <w:t>Locks, tests, autorización y rate limit</w:t>
+            </w:r>
             <w:r>
               <w:rPr>
                 <w:rFonts w:ascii="Calibri" w:hAnsi="Calibri" w:eastAsia="Calibri"/>
@@ -1467,7 +1473,6 @@
                 <w:color w:val="0B2545"/>
                 <w:sz w:val="17"/>
               </w:rPr>
-              <w:t>Locks, tests y pip check</w:t>
             </w:r>
           </w:p>
         </w:tc>
@@ -1496,7 +1501,9 @@
               <w:spacing w:before="0" w:after="0" w:line="264" w:lineRule="auto"/>
               <w:jc w:val="left"/>
             </w:pPr>
-            <w:r/>
+            <w:r>
+              <w:t>37 pruebas; HTTP 401/403/201/429</w:t>
+            </w:r>
             <w:r>
               <w:rPr>
                 <w:rFonts w:ascii="Calibri" w:hAnsi="Calibri" w:eastAsia="Calibri"/>
@@ -1504,7 +1511,6 @@
                 <w:color w:val="0B2545"/>
                 <w:sz w:val="17"/>
               </w:rPr>
-              <w:t>Validaciones aprobadas</w:t>
             </w:r>
           </w:p>
         </w:tc>
@@ -2249,7 +2255,9 @@
               <w:spacing w:before="0" w:after="0" w:line="264" w:lineRule="auto"/>
               <w:jc w:val="left"/>
             </w:pPr>
-            <w:r/>
+            <w:r>
+              <w:t>Healthy; sin reinicios nuevos</w:t>
+            </w:r>
             <w:r>
               <w:rPr>
                 <w:rFonts w:ascii="Calibri" w:hAnsi="Calibri" w:eastAsia="Calibri"/>
@@ -2257,7 +2265,6 @@
                 <w:color w:val="0B2545"/>
                 <w:sz w:val="17"/>
               </w:rPr>
-              <w:t>Healthy, restart=0</w:t>
             </w:r>
           </w:p>
         </w:tc>
@@ -2703,7 +2710,9 @@
               <w:spacing w:before="0" w:after="0" w:line="264" w:lineRule="auto"/>
               <w:jc w:val="left"/>
             </w:pPr>
-            <w:r/>
+            <w:r>
+              <w:t>docker run --rm --entrypoint python -v "$PWD:/src:ro" -w /src poultry-iot-system-v2-api:latest -m unittest discover -s local_tests -p 'test_*.py' -q</w:t>
+            </w:r>
             <w:r>
               <w:rPr>
                 <w:rFonts w:ascii="Calibri" w:hAnsi="Calibri" w:eastAsia="Calibri"/>
@@ -2711,7 +2720,6 @@
                 <w:color w:val="0B2545"/>
                 <w:sz w:val="16"/>
               </w:rPr>
-              <w:t>docker run --rm --entrypoint python -v "$PWD:/src:ro" -w /src poultry-iot-system-v2-api:latest -m unittest discover -s local_tests -p 'test_*.py'</w:t>
             </w:r>
           </w:p>
         </w:tc>
@@ -2937,7 +2945,11 @@
               <w:spacing w:before="0" w:after="0" w:line="264" w:lineRule="auto"/>
               <w:jc w:val="left"/>
             </w:pPr>
-            <w:r/>
+            <w:r>
+              <w:t>bash scripts/check_nginx_security_headers.sh</w:t>
+              <w:br/>
+              <w:t>https://poultry-system.duckdns.org</w:t>
+            </w:r>
             <w:r>
               <w:rPr>
                 <w:rFonts w:ascii="Calibri" w:hAnsi="Calibri" w:eastAsia="Calibri"/>
@@ -2945,7 +2957,6 @@
                 <w:color w:val="0B2545"/>
                 <w:sz w:val="16"/>
               </w:rPr>
-              <w:t>bash scripts/check_nginx_security_headers.sh https://poultry-system.duckdns.org</w:t>
             </w:r>
           </w:p>
         </w:tc>
@@ -2956,7 +2967,7 @@
         <w:pStyle w:val="Heading2"/>
       </w:pPr>
       <w:r>
-        <w:t>3.3 Despliegue del commit documental</w:t>
+        <w:t>3.3 Despliegue de Fase 6</w:t>
       </w:r>
     </w:p>
     <w:p>
@@ -2984,7 +2995,7 @@
         <w:br/>
         <w:t>old_short="$(git rev-parse --short HEAD)"</w:t>
         <w:br/>
-        <w:t>git branch "rollback/pre-commit29-$old_short" "$old_sha"</w:t>
+        <w:t>git branch "rollback/pre-hardening-closure-$old_short" "$old_sha"</w:t>
         <w:br/>
         <w:t>git fetch origin dev</w:t>
         <w:br/>
@@ -3039,7 +3050,7 @@
                 <w:color w:val="1F4D78"/>
                 <w:sz w:val="21"/>
               </w:rPr>
-              <w:t xml:space="preserve">Sin reinicios: </w:t>
+              <w:t>Despliegue diferenciado: los commits 29 y 30 sólo documentan; el cierre residual modifica API y dashboard, por lo que exige reconstruir esos servicios y comprobar salud antes de finalizar.</w:t>
             </w:r>
             <w:r>
               <w:rPr>
@@ -3047,7 +3058,6 @@
                 <w:color w:val="0B2545"/>
                 <w:sz w:val="21"/>
               </w:rPr>
-              <w:t>El commit 29 sólo actualiza documentación. No ejecutar docker compose build/up, migraciones ni systemctl reload nginx.</w:t>
             </w:r>
           </w:p>
         </w:tc>
@@ -3873,7 +3883,9 @@
               <w:spacing w:before="0" w:after="0" w:line="264" w:lineRule="auto"/>
               <w:jc w:val="left"/>
             </w:pPr>
-            <w:r/>
+            <w:r>
+              <w:t>Demostrar la rama, el SHA y el alcance exacto del cierre final posterior al commit 30.</w:t>
+            </w:r>
             <w:r>
               <w:rPr>
                 <w:rFonts w:ascii="Calibri" w:hAnsi="Calibri" w:eastAsia="Calibri"/>
@@ -3881,7 +3893,6 @@
                 <w:color w:val="0B2545"/>
                 <w:sz w:val="19"/>
               </w:rPr>
-              <w:t>Demostrar la rama de trabajo, el SHA base y el alcance exacto del commit 29.</w:t>
             </w:r>
           </w:p>
         </w:tc>
@@ -4029,7 +4040,9 @@
               <w:spacing w:before="0" w:after="0" w:line="264" w:lineRule="auto"/>
               <w:jc w:val="left"/>
             </w:pPr>
-            <w:r/>
+            <w:r>
+              <w:t>Rama codex/hardening-final-closure y únicamente código, pruebas y documentación previstos.</w:t>
+            </w:r>
             <w:r>
               <w:rPr>
                 <w:rFonts w:ascii="Calibri" w:hAnsi="Calibri" w:eastAsia="Calibri"/>
@@ -4037,7 +4050,6 @@
                 <w:color w:val="0B2545"/>
                 <w:sz w:val="19"/>
               </w:rPr>
-              <w:t>Rama docs/29-deployment-security-evidence-guide y únicamente archivos documentales previstos.</w:t>
             </w:r>
           </w:p>
         </w:tc>
@@ -4366,7 +4378,9 @@
               <w:spacing w:before="0" w:after="0" w:line="264" w:lineRule="auto"/>
               <w:jc w:val="left"/>
             </w:pPr>
-            <w:r/>
+            <w:r>
+              <w:t>Relacionar los controles 25, 27 y 28 con CI y el cierre residual con la suite local reproducible.</w:t>
+            </w:r>
             <w:r>
               <w:rPr>
                 <w:rFonts w:ascii="Calibri" w:hAnsi="Calibri" w:eastAsia="Calibri"/>
@@ -4374,7 +4388,6 @@
                 <w:color w:val="0B2545"/>
                 <w:sz w:val="19"/>
               </w:rPr>
-              <w:t>Relacionar los controles 25, 27 y 28 con ejecuciones verificables de CI.</w:t>
             </w:r>
           </w:p>
         </w:tc>
@@ -5272,7 +5285,7 @@
         <w:pStyle w:val="Heading1"/>
       </w:pPr>
       <w:r>
-        <w:t>E29-04 · Locks y regresión</w:t>
+        <w:t>E29-04 · Cierre técnico</w:t>
       </w:r>
     </w:p>
     <w:tbl>
@@ -5352,7 +5365,9 @@
               <w:spacing w:before="0" w:after="0" w:line="264" w:lineRule="auto"/>
               <w:jc w:val="left"/>
             </w:pPr>
-            <w:r/>
+            <w:r>
+              <w:t>Confirmar autorización administrativa, respuestas genéricas, límites explícitos y 37 pruebas aprobadas.</w:t>
+            </w:r>
             <w:r>
               <w:rPr>
                 <w:rFonts w:ascii="Calibri" w:hAnsi="Calibri" w:eastAsia="Calibri"/>
@@ -5360,7 +5375,6 @@
                 <w:color w:val="0B2545"/>
                 <w:sz w:val="19"/>
               </w:rPr>
-              <w:t>Confirmar locks válidos, pruebas aprobadas y dependencias instaladas de forma consistente.</w:t>
             </w:r>
           </w:p>
         </w:tc>
@@ -5430,7 +5444,9 @@
               <w:spacing w:before="0" w:after="0" w:line="264" w:lineRule="auto"/>
               <w:jc w:val="left"/>
             </w:pPr>
-            <w:r/>
+            <w:r>
+              <w:t>Suite local completa y comprobaciones HTTP 401/403/201/429</w:t>
+            </w:r>
             <w:r>
               <w:rPr>
                 <w:rFonts w:ascii="Calibri" w:hAnsi="Calibri" w:eastAsia="Calibri"/>
@@ -5438,7 +5454,6 @@
                 <w:color w:val="0B2545"/>
                 <w:sz w:val="19"/>
               </w:rPr>
-              <w:t>poetry check --lock, unittest y python -m pip check</w:t>
             </w:r>
           </w:p>
         </w:tc>
@@ -5508,7 +5523,9 @@
               <w:spacing w:before="0" w:after="0" w:line="264" w:lineRule="auto"/>
               <w:jc w:val="left"/>
             </w:pPr>
-            <w:r/>
+            <w:r>
+              <w:t>37 pruebas OK; registro protegido y rate limit operativo.</w:t>
+            </w:r>
             <w:r>
               <w:rPr>
                 <w:rFonts w:ascii="Calibri" w:hAnsi="Calibri" w:eastAsia="Calibri"/>
@@ -5516,7 +5533,6 @@
                 <w:color w:val="0B2545"/>
                 <w:sz w:val="19"/>
               </w:rPr>
-              <w:t>All set, pruebas OK y No broken requirements found.</w:t>
             </w:r>
           </w:p>
         </w:tc>
@@ -5687,7 +5703,7 @@
         <w:jc w:val="center"/>
       </w:pPr>
       <w:r>
-        <w:t>Figura E29-04. Locks y regresión — evidencia pendiente de inserción y revisión.</w:t>
+        <w:t>Figura E29-04. Cierre técnico — evidencia pendiente de inserción y revisión.</w:t>
       </w:r>
     </w:p>
     <w:tbl>
@@ -7817,7 +7833,9 @@
               <w:spacing w:before="0" w:after="0" w:line="264" w:lineRule="auto"/>
               <w:jc w:val="left"/>
             </w:pPr>
-            <w:r/>
+            <w:r>
+              <w:t>Verificar que el cierre residual reconstruyó los servicios previstos sin degradar la plataforma.</w:t>
+            </w:r>
             <w:r>
               <w:rPr>
                 <w:rFonts w:ascii="Calibri" w:hAnsi="Calibri" w:eastAsia="Calibri"/>
@@ -7825,7 +7843,6 @@
                 <w:color w:val="0B2545"/>
                 <w:sz w:val="19"/>
               </w:rPr>
-              <w:t>Verificar que el despliegue documental no reinició ni degradó servicios.</w:t>
             </w:r>
           </w:p>
         </w:tc>
@@ -7973,7 +7990,9 @@
               <w:spacing w:before="0" w:after="0" w:line="264" w:lineRule="auto"/>
               <w:jc w:val="left"/>
             </w:pPr>
-            <w:r/>
+            <w:r>
+              <w:t>Cinco servicios healthy y sin reinicios nuevos; registrar aparte cualquier contador histórico.</w:t>
+            </w:r>
             <w:r>
               <w:rPr>
                 <w:rFonts w:ascii="Calibri" w:hAnsi="Calibri" w:eastAsia="Calibri"/>
@@ -7981,7 +8000,6 @@
                 <w:color w:val="0B2545"/>
                 <w:sz w:val="19"/>
               </w:rPr>
-              <w:t>Cinco servicios healthy, restart=0 y sin errores nuevos de Nginx.</w:t>
             </w:r>
           </w:p>
         </w:tc>
@@ -8388,7 +8406,9 @@
               <w:spacing w:before="0" w:after="0" w:line="264" w:lineRule="auto"/>
               <w:jc w:val="left"/>
             </w:pPr>
-            <w:r/>
+            <w:r>
+              <w:t>Rama rollback/pre-hardening-closure-SHA y nombre lógico del respaldo aplicable</w:t>
+            </w:r>
             <w:r>
               <w:rPr>
                 <w:rFonts w:ascii="Calibri" w:hAnsi="Calibri" w:eastAsia="Calibri"/>
@@ -8396,7 +8416,6 @@
                 <w:color w:val="0B2545"/>
                 <w:sz w:val="19"/>
               </w:rPr>
-              <w:t>Rama rollback/pre-commit29-SHA y nombre lógico del respaldo aplicable</w:t>
             </w:r>
           </w:p>
         </w:tc>
@@ -8731,7 +8750,7 @@
         <w:keepNext/>
       </w:pPr>
       <w:r>
-        <w:t>Antes de publicar el commit 29 o distribuir este documento, confirmar los siguientes puntos.</w:t>
+        <w:t>Antes de distribuir el expediente final de hardening, confirmar los siguientes puntos.</w:t>
       </w:r>
     </w:p>
     <w:tbl>
@@ -9201,7 +9220,9 @@
               <w:spacing w:before="0" w:after="0" w:line="264" w:lineRule="auto"/>
               <w:jc w:val="left"/>
             </w:pPr>
-            <w:r/>
+            <w:r>
+              <w:t>El staged diff contiene únicamente los archivos del cierre final.</w:t>
+            </w:r>
             <w:r>
               <w:rPr>
                 <w:rFonts w:ascii="Calibri" w:hAnsi="Calibri" w:eastAsia="Calibri"/>
@@ -9209,7 +9230,6 @@
                 <w:color w:val="0B2545"/>
                 <w:sz w:val="19"/>
               </w:rPr>
-              <w:t>El staged diff contiene únicamente archivos del commit 29.</w:t>
             </w:r>
           </w:p>
         </w:tc>
@@ -9279,7 +9299,9 @@
               <w:spacing w:before="0" w:after="0" w:line="264" w:lineRule="auto"/>
               <w:jc w:val="left"/>
             </w:pPr>
-            <w:r/>
+            <w:r>
+              <w:t>El PR del cierre fue revisado y las validaciones aplicables terminaron correctamente.</w:t>
+            </w:r>
             <w:r>
               <w:rPr>
                 <w:rFonts w:ascii="Calibri" w:hAnsi="Calibri" w:eastAsia="Calibri"/>
@@ -9287,7 +9309,6 @@
                 <w:color w:val="0B2545"/>
                 <w:sz w:val="19"/>
               </w:rPr>
-              <w:t>El PR fue revisado aunque los workflows filtrados no se ejecutaran automáticamente.</w:t>
             </w:r>
           </w:p>
         </w:tc>
@@ -9357,7 +9378,9 @@
               <w:spacing w:before="0" w:after="0" w:line="264" w:lineRule="auto"/>
               <w:jc w:val="left"/>
             </w:pPr>
-            <w:r/>
+            <w:r>
+              <w:t>El Droplet actualizó el checkout y reconstruyó únicamente API, dashboard y subscriber.</w:t>
+            </w:r>
             <w:r>
               <w:rPr>
                 <w:rFonts w:ascii="Calibri" w:hAnsi="Calibri" w:eastAsia="Calibri"/>
@@ -9365,7 +9388,6 @@
                 <w:color w:val="0B2545"/>
                 <w:sz w:val="19"/>
               </w:rPr>
-              <w:t>El Droplet actualizó el checkout sin reiniciar Docker, Nginx o PostgreSQL.</w:t>
             </w:r>
           </w:p>
         </w:tc>
@@ -9435,7 +9457,9 @@
               <w:spacing w:before="0" w:after="0" w:line="264" w:lineRule="auto"/>
               <w:jc w:val="left"/>
             </w:pPr>
-            <w:r/>
+            <w:r>
+              <w:t>Los cinco servicios permanecen saludables y sin reinicios nuevos; cualquier contador histórico está anotado.</w:t>
+            </w:r>
             <w:r>
               <w:rPr>
                 <w:rFonts w:ascii="Calibri" w:hAnsi="Calibri" w:eastAsia="Calibri"/>
@@ -9443,7 +9467,6 @@
                 <w:color w:val="0B2545"/>
                 <w:sz w:val="19"/>
               </w:rPr>
-              <w:t>Los cinco servicios permanecen saludables y con restart=0.</w:t>
             </w:r>
           </w:p>
         </w:tc>
@@ -9537,7 +9560,7 @@
     </w:p>
     <w:p>
       <w:r>
-        <w:t>El proyecto conserva un procedimiento único y reproducible para validar y evidenciar el cierre de la fase 6. El expediente permite demostrar el control aplicado sin depender del historial del chat y sin divulgar material sensible.</w:t>
+        <w:t>El proyecto conserva un procedimiento único y reproducible para validar y evidenciar los commits 25 a 30 y su cierre residual. El expediente permite demostrar los controles aplicados sin depender del historial del chat y sin divulgar material sensible.</w:t>
       </w:r>
     </w:p>
     <w:tbl>
@@ -9586,7 +9609,7 @@
                 <w:color w:val="1F4D78"/>
                 <w:sz w:val="21"/>
               </w:rPr>
-              <w:t xml:space="preserve">Mensaje previsto: </w:t>
+              <w:t>Mensaje previsto: security: close residual hardening risks</w:t>
             </w:r>
             <w:r>
               <w:rPr>
@@ -9594,7 +9617,6 @@
                 <w:color w:val="0B2545"/>
                 <w:sz w:val="21"/>
               </w:rPr>
-              <w:t>docs: add deployment and security evidence guide</w:t>
             </w:r>
           </w:p>
         </w:tc>
@@ -9691,9 +9713,7 @@
         <w:color w:val="5B6573"/>
         <w:sz w:val="17"/>
       </w:rPr>
-      <w:t>Poultry IoT System v2</w:t>
-      <w:tab/>
-      <w:t>Hardening · Fase 6 · Commit 29</w:t>
+      <w:t>Hardening · Fase 6 · Commits 25-30 + cierre</w:t>
     </w:r>
   </w:p>
 </w:hdr>

</xml_diff>